<commit_message>
Updated resume date. Updated verbiage.
</commit_message>
<xml_diff>
--- a/src/assets/stephen-humburg-resume.docx
+++ b/src/assets/stephen-humburg-resume.docx
@@ -11,7 +11,37 @@
           <w:sz w:val="56"/>
           <w:szCs w:val="56"/>
         </w:rPr>
-        <w:t>STEPHEN HUMBURG</w:t>
+        <w:t>S</w:t>
+      </w:r>
+      <w:r>
+        <w:rPr>
+          <w:b/>
+          <w:bCs/>
+          <w:color w:val="1A2B4A"/>
+          <w:sz w:val="56"/>
+          <w:szCs w:val="56"/>
+        </w:rPr>
+        <w:t>tephen</w:t>
+      </w:r>
+      <w:r>
+        <w:rPr>
+          <w:b/>
+          <w:bCs/>
+          <w:color w:val="1A2B4A"/>
+          <w:sz w:val="56"/>
+          <w:szCs w:val="56"/>
+        </w:rPr>
+        <w:t xml:space="preserve"> H</w:t>
+      </w:r>
+      <w:r>
+        <w:rPr>
+          <w:b/>
+          <w:bCs/>
+          <w:color w:val="1A2B4A"/>
+          <w:sz w:val="56"/>
+          <w:szCs w:val="56"/>
+        </w:rPr>
+        <w:t>umburg</w:t>
       </w:r>
     </w:p>
     <w:p>
@@ -30,6 +60,52 @@
       </w:r>
     </w:p>
     <w:p>
+      <w:r>
+        <w:rPr>
+          <w:color w:val="6B7280"/>
+          <w:sz w:val="19"/>
+          <w:szCs w:val="19"/>
+        </w:rPr>
+        <w:t>+1 512-772-</w:t>
+      </w:r>
+      <w:proofErr w:type="gramStart"/>
+      <w:r>
+        <w:rPr>
+          <w:color w:val="6B7280"/>
+          <w:sz w:val="19"/>
+          <w:szCs w:val="19"/>
+        </w:rPr>
+        <w:t>6977  |</w:t>
+      </w:r>
+      <w:proofErr w:type="gramEnd"/>
+      <w:r>
+        <w:rPr>
+          <w:color w:val="6B7280"/>
+          <w:sz w:val="19"/>
+          <w:szCs w:val="19"/>
+        </w:rPr>
+        <w:t xml:space="preserve">  </w:t>
+      </w:r>
+      <w:proofErr w:type="gramStart"/>
+      <w:r>
+        <w:rPr>
+          <w:color w:val="6B7280"/>
+          <w:sz w:val="19"/>
+          <w:szCs w:val="19"/>
+        </w:rPr>
+        <w:t>IAMGARLUG@GMAIL.COM  |</w:t>
+      </w:r>
+      <w:proofErr w:type="gramEnd"/>
+      <w:r>
+        <w:rPr>
+          <w:color w:val="6B7280"/>
+          <w:sz w:val="19"/>
+          <w:szCs w:val="19"/>
+        </w:rPr>
+        <w:t xml:space="preserve">  Austin, TX</w:t>
+      </w:r>
+    </w:p>
+    <w:p>
       <w:pPr>
         <w:pBdr>
           <w:bottom w:val="single" w:sz="18" w:space="1" w:color="2E7D9E"/>
@@ -46,21 +122,7 @@
           <w:sz w:val="20"/>
           <w:szCs w:val="20"/>
         </w:rPr>
-        <w:t xml:space="preserve">I spent over 30 years honing my skills building scalable, reliable, and relatable PC and web solutions across healthcare, gaming, automotive, pharmaceutical, governmental, military, and energy sectors. I am currently pioneering AI </w:t>
-      </w:r>
-      <w:r>
-        <w:rPr>
-          <w:sz w:val="20"/>
-          <w:szCs w:val="20"/>
-        </w:rPr>
-        <w:t xml:space="preserve">tool and agent </w:t>
-      </w:r>
-      <w:r>
-        <w:rPr>
-          <w:sz w:val="20"/>
-          <w:szCs w:val="20"/>
-        </w:rPr>
-        <w:t>integration in IEEE-regulated environments. I also work with clients and internal teams on improvement to their software delivery process.</w:t>
+        <w:t>Versatile software engineer with broad industry experience — healthcare, gaming, automotive, pharmaceutical, government, military, and energy — building scalable, reliable PC and web solutions. Now at the forefront of AI tool and agent integration in IEEE-regulated environments, driving technical strategy and enabling engineering teams to modernize software delivery practices.</w:t>
       </w:r>
     </w:p>
     <w:p>
@@ -158,7 +220,7 @@
                 <w:sz w:val="20"/>
                 <w:szCs w:val="20"/>
               </w:rPr>
-              <w:t>C#, JavaScript, HTML, CSS, PowerShell, Java, Python, Perl</w:t>
+              <w:t>C#, JavaScript, HTML, CSS, PowerShell, Java</w:t>
             </w:r>
           </w:p>
         </w:tc>
@@ -612,7 +674,7 @@
           <w:sz w:val="20"/>
           <w:szCs w:val="20"/>
         </w:rPr>
-        <w:t>Present</w:t>
+        <w:t>05/2026</w:t>
       </w:r>
       <w:r>
         <w:rPr>
@@ -936,21 +998,12 @@
         </w:numPr>
         <w:spacing w:before="40" w:after="40"/>
       </w:pPr>
-      <w:proofErr w:type="gramStart"/>
-      <w:r>
-        <w:rPr>
-          <w:sz w:val="20"/>
-          <w:szCs w:val="20"/>
-        </w:rPr>
-        <w:t>Led</w:t>
-      </w:r>
-      <w:proofErr w:type="gramEnd"/>
-      <w:r>
-        <w:rPr>
-          <w:sz w:val="20"/>
-          <w:szCs w:val="20"/>
-        </w:rPr>
-        <w:t xml:space="preserve"> fellow developers through mentorship and brown bag presentations.</w:t>
+      <w:r>
+        <w:rPr>
+          <w:sz w:val="20"/>
+          <w:szCs w:val="20"/>
+        </w:rPr>
+        <w:t>Led fellow developers through mentorship and brown bag presentations.</w:t>
       </w:r>
     </w:p>
     <w:p>
@@ -1252,7 +1305,27 @@
         <w:spacing w:before="240" w:after="80"/>
       </w:pPr>
       <w:r>
-        <w:t>20+ years of progressive software development roles across government, healthcare and enterprise sectors including holding US government secret-level security clearance.</w:t>
+        <w:t xml:space="preserve">Diverse software development experience across government, healthcare, and enterprise sectors </w:t>
+      </w:r>
+      <w:r>
+        <w:t>-</w:t>
+      </w:r>
+      <w:r>
+        <w:t xml:space="preserve"> including US government secret-level security clearance </w:t>
+      </w:r>
+      <w:r>
+        <w:t>-</w:t>
+      </w:r>
+      <w:r>
+        <w:t xml:space="preserve"> </w:t>
+      </w:r>
+      <w:proofErr w:type="gramStart"/>
+      <w:r>
+        <w:t>demonstrating</w:t>
+      </w:r>
+      <w:proofErr w:type="gramEnd"/>
+      <w:r>
+        <w:t xml:space="preserve"> adaptability and trustworthiness across high-stakes environments.</w:t>
       </w:r>
     </w:p>
     <w:p>
@@ -1285,22 +1358,6 @@
       <w:pPr>
         <w:spacing w:before="200" w:after="40"/>
       </w:pPr>
-      <w:r>
-        <w:rPr>
-          <w:i/>
-          <w:iCs/>
-          <w:sz w:val="20"/>
-          <w:szCs w:val="20"/>
-        </w:rPr>
-        <w:t>August 1998</w:t>
-      </w:r>
-      <w:r>
-        <w:rPr>
-          <w:sz w:val="20"/>
-          <w:szCs w:val="20"/>
-        </w:rPr>
-        <w:t xml:space="preserve"> – </w:t>
-      </w:r>
       <w:r>
         <w:rPr>
           <w:b/>
@@ -1968,7 +2025,6 @@
   <w:style w:type="character" w:default="1" w:styleId="DefaultParagraphFont">
     <w:name w:val="Default Paragraph Font"/>
     <w:uiPriority w:val="1"/>
-    <w:semiHidden/>
     <w:unhideWhenUsed/>
   </w:style>
   <w:style w:type="table" w:default="1" w:styleId="TableNormal">

</xml_diff>

<commit_message>
Updated blurb because it implied I still worked at DG.
</commit_message>
<xml_diff>
--- a/src/assets/stephen-humburg-resume.docx
+++ b/src/assets/stephen-humburg-resume.docx
@@ -66,43 +66,7 @@
           <w:sz w:val="19"/>
           <w:szCs w:val="19"/>
         </w:rPr>
-        <w:t>+1 512-772-</w:t>
-      </w:r>
-      <w:proofErr w:type="gramStart"/>
-      <w:r>
-        <w:rPr>
-          <w:color w:val="6B7280"/>
-          <w:sz w:val="19"/>
-          <w:szCs w:val="19"/>
-        </w:rPr>
-        <w:t>6977  |</w:t>
-      </w:r>
-      <w:proofErr w:type="gramEnd"/>
-      <w:r>
-        <w:rPr>
-          <w:color w:val="6B7280"/>
-          <w:sz w:val="19"/>
-          <w:szCs w:val="19"/>
-        </w:rPr>
-        <w:t xml:space="preserve">  </w:t>
-      </w:r>
-      <w:proofErr w:type="gramStart"/>
-      <w:r>
-        <w:rPr>
-          <w:color w:val="6B7280"/>
-          <w:sz w:val="19"/>
-          <w:szCs w:val="19"/>
-        </w:rPr>
-        <w:t>IAMGARLUG@GMAIL.COM  |</w:t>
-      </w:r>
-      <w:proofErr w:type="gramEnd"/>
-      <w:r>
-        <w:rPr>
-          <w:color w:val="6B7280"/>
-          <w:sz w:val="19"/>
-          <w:szCs w:val="19"/>
-        </w:rPr>
-        <w:t xml:space="preserve">  Austin, TX</w:t>
+        <w:t>+1 512-772-6977  |  IAMGARLUG@GMAIL.COM  |  Austin, TX</w:t>
       </w:r>
     </w:p>
     <w:p>
@@ -122,7 +86,7 @@
           <w:sz w:val="20"/>
           <w:szCs w:val="20"/>
         </w:rPr>
-        <w:t>Versatile software engineer with broad industry experience — healthcare, gaming, automotive, pharmaceutical, government, military, and energy — building scalable, reliable PC and web solutions. Now at the forefront of AI tool and agent integration in IEEE-regulated environments, driving technical strategy and enabling engineering teams to modernize software delivery practices.</w:t>
+        <w:t>Versatile software engineer with broad industry experience — healthcare, gaming, automotive, pharmaceutical, government, military, and energy — building scalable, reliable PC and web solutions. Experienced in thoughtfully integrating AI tools and agents into complex, regulated environments, while driving technical strategy and enabling engineering teams to modernize software delivery practices.</w:t>
       </w:r>
     </w:p>
     <w:p>
@@ -1317,15 +1281,7 @@
         <w:t>-</w:t>
       </w:r>
       <w:r>
-        <w:t xml:space="preserve"> </w:t>
-      </w:r>
-      <w:proofErr w:type="gramStart"/>
-      <w:r>
-        <w:t>demonstrating</w:t>
-      </w:r>
-      <w:proofErr w:type="gramEnd"/>
-      <w:r>
-        <w:t xml:space="preserve"> adaptability and trustworthiness across high-stakes environments.</w:t>
+        <w:t xml:space="preserve"> demonstrating adaptability and trustworthiness across high-stakes environments.</w:t>
       </w:r>
     </w:p>
     <w:p>

</xml_diff>